<commit_message>
fix: completely remove coordinate repositioning on city change to preserve real coordinates
</commit_message>
<xml_diff>
--- a/docs/ameloration.docx
+++ b/docs/ameloration.docx
@@ -9,12 +9,28 @@
     </w:p>
     <w:p>
       <w:r>
-        <w:t xml:space="preserve">  paramètres, le système repositionnait automatiquement les bacs existants autour de cette nouvelle ville pour simuler</w:t>
-      </w:r>
-    </w:p>
-    <w:p>
-      <w:r>
-        <w:t xml:space="preserve">  la démonstration. C'est ce qui vous donnait cette impression de "bascule de ville en ville".</w:t>
+        <w:t xml:space="preserve">  </w:t>
+      </w:r>
+      <w:proofErr w:type="gramStart"/>
+      <w:r>
+        <w:t>paramètres</w:t>
+      </w:r>
+      <w:proofErr w:type="gramEnd"/>
+      <w:r>
+        <w:t>, le système repositionnait automatiquement les bacs existants autour de cette nouvelle ville pour simuler</w:t>
+      </w:r>
+    </w:p>
+    <w:p>
+      <w:r>
+        <w:t xml:space="preserve">  </w:t>
+      </w:r>
+      <w:proofErr w:type="gramStart"/>
+      <w:r>
+        <w:t>la</w:t>
+      </w:r>
+      <w:proofErr w:type="gramEnd"/>
+      <w:r>
+        <w:t xml:space="preserve"> démonstration. C'est ce qui vous donnait cette impression de "bascule de ville en ville".</w:t>
       </w:r>
     </w:p>
     <w:p/>
@@ -60,17 +76,41 @@
     </w:p>
     <w:p>
       <w:r>
-        <w:t xml:space="preserve">      automatiquement un zoom arrière global (niveau 7) centré sur le Bénin et affiche la totalité des bacs présents</w:t>
-      </w:r>
-    </w:p>
-    <w:p>
-      <w:r>
-        <w:t xml:space="preserve">      dans votre base de données à leurs vraies coordonnées (Cotonou, Calavi, Bohicon, Natitingou, etc., en même</w:t>
-      </w:r>
-    </w:p>
-    <w:p>
-      <w:r>
-        <w:t xml:space="preserve">      temps).</w:t>
+        <w:t xml:space="preserve">      </w:t>
+      </w:r>
+      <w:proofErr w:type="gramStart"/>
+      <w:r>
+        <w:t>automatiquement</w:t>
+      </w:r>
+      <w:proofErr w:type="gramEnd"/>
+      <w:r>
+        <w:t xml:space="preserve"> un zoom arrière global (niveau 7) centré sur le Bénin et affiche la totalité des bacs présents</w:t>
+      </w:r>
+    </w:p>
+    <w:p>
+      <w:r>
+        <w:t xml:space="preserve">      </w:t>
+      </w:r>
+      <w:proofErr w:type="gramStart"/>
+      <w:r>
+        <w:t>dans</w:t>
+      </w:r>
+      <w:proofErr w:type="gramEnd"/>
+      <w:r>
+        <w:t xml:space="preserve"> votre base de données à leurs vraies coordonnées (Cotonou, Calavi, Bohicon, Natitingou, etc., en même</w:t>
+      </w:r>
+    </w:p>
+    <w:p>
+      <w:r>
+        <w:t xml:space="preserve">      </w:t>
+      </w:r>
+      <w:proofErr w:type="gramStart"/>
+      <w:r>
+        <w:t>temps</w:t>
+      </w:r>
+      <w:proofErr w:type="gramEnd"/>
+      <w:r>
+        <w:t>).</w:t>
       </w:r>
     </w:p>
     <w:p>
@@ -80,7 +120,15 @@
     </w:p>
     <w:p>
       <w:r>
-        <w:t xml:space="preserve">      coordonnées GPS de vos bacs existants. Ils restent bien fixés à leurs positions réelles.</w:t>
+        <w:t xml:space="preserve">      </w:t>
+      </w:r>
+      <w:proofErr w:type="gramStart"/>
+      <w:r>
+        <w:t>coordonnées</w:t>
+      </w:r>
+      <w:proofErr w:type="gramEnd"/>
+      <w:r>
+        <w:t xml:space="preserve"> GPS de vos bacs existants. Ils restent bien fixés à leurs positions réelles.</w:t>
       </w:r>
     </w:p>
     <w:p>
@@ -90,23 +138,71 @@
     </w:p>
     <w:p>
       <w:r>
-        <w:t xml:space="preserve">      • Si vous choisissez une ville spécifique (ex: Bohicon ou Ouidah) : Seuls les bacs qui se trouvent réellement</w:t>
-      </w:r>
-    </w:p>
-    <w:p>
-      <w:r>
-        <w:t xml:space="preserve">      dans cette zone géographique s'afficheront sur la carte et dans les listes. Si aucun bac n'est dans cette ville,</w:t>
-      </w:r>
-    </w:p>
-    <w:p>
-      <w:r>
-        <w:t xml:space="preserve">      la carte et le tableau resteront vides</w:t>
+        <w:t xml:space="preserve">      • Si vous choisissez une ville spécifique (</w:t>
+      </w:r>
+      <w:proofErr w:type="gramStart"/>
+      <w:r>
+        <w:t>ex:</w:t>
+      </w:r>
+      <w:proofErr w:type="gramEnd"/>
+      <w:r>
+        <w:t xml:space="preserve"> Bohicon ou Ouidah) : Seuls les bacs qui se trouvent réellement</w:t>
+      </w:r>
+    </w:p>
+    <w:p>
+      <w:r>
+        <w:t xml:space="preserve">      </w:t>
+      </w:r>
+      <w:proofErr w:type="gramStart"/>
+      <w:r>
+        <w:t>dans</w:t>
+      </w:r>
+      <w:proofErr w:type="gramEnd"/>
+      <w:r>
+        <w:t xml:space="preserve"> cette zone géographique s'afficheront sur la carte et dans les listes. Si aucun bac n'est dans cette ville,</w:t>
+      </w:r>
+    </w:p>
+    <w:p>
+      <w:r>
+        <w:t xml:space="preserve">      </w:t>
+      </w:r>
+      <w:proofErr w:type="gramStart"/>
+      <w:r>
+        <w:t>la</w:t>
+      </w:r>
+      <w:proofErr w:type="gramEnd"/>
+      <w:r>
+        <w:t xml:space="preserve"> carte et le tableau resteront vides</w:t>
       </w:r>
     </w:p>
     <w:p/>
     <w:p>
       <w:r>
-        <w:t xml:space="preserve">Et je veux que ca soit de meme pour les autre c’est-à-dire collecte ; bacs ;alerte ;rapport ; </w:t>
+        <w:t xml:space="preserve">Et je veux que </w:t>
+      </w:r>
+      <w:proofErr w:type="gramStart"/>
+      <w:r>
+        <w:t>ca</w:t>
+      </w:r>
+      <w:proofErr w:type="gramEnd"/>
+      <w:r>
+        <w:t xml:space="preserve"> soit de meme pour </w:t>
+      </w:r>
+      <w:proofErr w:type="gramStart"/>
+      <w:r>
+        <w:t>les autre</w:t>
+      </w:r>
+      <w:proofErr w:type="gramEnd"/>
+      <w:r>
+        <w:t xml:space="preserve"> c’est-à-dire collecte ; bacs</w:t>
+      </w:r>
+      <w:proofErr w:type="gramStart"/>
+      <w:r>
+        <w:t> ;alerte ;rapport</w:t>
+      </w:r>
+      <w:proofErr w:type="gramEnd"/>
+      <w:r>
+        <w:t xml:space="preserve"> ; </w:t>
       </w:r>
       <w:proofErr w:type="spellStart"/>
       <w:r>
@@ -117,6 +213,7 @@
         <w:t xml:space="preserve"> ; tout le tableau de bord </w:t>
       </w:r>
       <w:proofErr w:type="spellStart"/>
+      <w:proofErr w:type="gramStart"/>
       <w:r>
         <w:t>aussu</w:t>
       </w:r>
@@ -124,16 +221,19 @@
       <w:r>
         <w:t> ::</w:t>
       </w:r>
+      <w:proofErr w:type="gramEnd"/>
     </w:p>
     <w:p>
       <w:r>
         <w:t xml:space="preserve">NB : fait </w:t>
       </w:r>
       <w:proofErr w:type="spellStart"/>
+      <w:proofErr w:type="gramStart"/>
       <w:r>
         <w:t>ca</w:t>
       </w:r>
       <w:proofErr w:type="spellEnd"/>
+      <w:proofErr w:type="gramEnd"/>
       <w:r>
         <w:t xml:space="preserve"> d’</w:t>
       </w:r>
@@ -202,7 +302,7 @@
                     <pic:cNvPicPr/>
                   </pic:nvPicPr>
                   <pic:blipFill>
-                    <a:blip r:embed="rId4"/>
+                    <a:blip r:embed="rId5"/>
                     <a:stretch>
                       <a:fillRect/>
                     </a:stretch>
@@ -223,6 +323,227 @@
         </w:drawing>
       </w:r>
     </w:p>
+    <w:p/>
+    <w:p/>
+    <w:p/>
+    <w:p/>
+    <w:p>
+      <w:r>
+        <w:t>Il y a un bug de logique dans le filtrage des bacs.</w:t>
+      </w:r>
+    </w:p>
+    <w:p>
+      <w:r>
+        <w:t>Le paramètre "Zone d'intervention géographique" doit servir de filtre global.</w:t>
+      </w:r>
+    </w:p>
+    <w:p>
+      <w:r>
+        <w:t>Les règles métier sont les suivantes :</w:t>
+      </w:r>
+    </w:p>
+    <w:p>
+      <w:pPr>
+        <w:numPr>
+          <w:ilvl w:val="0"/>
+          <w:numId w:val="1"/>
+        </w:numPr>
+      </w:pPr>
+      <w:r>
+        <w:t xml:space="preserve">Si la ville sélectionnée est </w:t>
+      </w:r>
+      <w:r>
+        <w:rPr>
+          <w:b/>
+          <w:bCs/>
+        </w:rPr>
+        <w:t>"Tous"</w:t>
+      </w:r>
+      <w:r>
+        <w:t xml:space="preserve">, afficher tous les bacs de toutes les villes. </w:t>
+      </w:r>
+    </w:p>
+    <w:p>
+      <w:pPr>
+        <w:numPr>
+          <w:ilvl w:val="0"/>
+          <w:numId w:val="1"/>
+        </w:numPr>
+      </w:pPr>
+      <w:r>
+        <w:t xml:space="preserve">Si une ville est sélectionnée (exemple : Djougou), afficher uniquement les bacs dont les coordonnées GPS </w:t>
+      </w:r>
+      <w:proofErr w:type="gramStart"/>
+      <w:r>
+        <w:t>appartiennent</w:t>
+      </w:r>
+      <w:proofErr w:type="gramEnd"/>
+      <w:r>
+        <w:t xml:space="preserve"> à cette ville. </w:t>
+      </w:r>
+    </w:p>
+    <w:p>
+      <w:pPr>
+        <w:numPr>
+          <w:ilvl w:val="0"/>
+          <w:numId w:val="1"/>
+        </w:numPr>
+      </w:pPr>
+      <w:r>
+        <w:t xml:space="preserve">Si aucun bac n'appartient à cette ville, la table doit être vide et la carte ne doit afficher aucun marqueur. </w:t>
+      </w:r>
+    </w:p>
+    <w:p>
+      <w:pPr>
+        <w:numPr>
+          <w:ilvl w:val="0"/>
+          <w:numId w:val="1"/>
+        </w:numPr>
+      </w:pPr>
+      <w:r>
+        <w:t xml:space="preserve">Il est strictement interdit de repositionner ou déplacer les coordonnées GPS des bacs existants lors d'un changement de ville. </w:t>
+      </w:r>
+    </w:p>
+    <w:p>
+      <w:pPr>
+        <w:numPr>
+          <w:ilvl w:val="0"/>
+          <w:numId w:val="1"/>
+        </w:numPr>
+      </w:pPr>
+      <w:r>
+        <w:t xml:space="preserve">Le changement de ville ne doit modifier que le filtre d'affichage, jamais les données des bacs. </w:t>
+      </w:r>
+    </w:p>
+    <w:p>
+      <w:r>
+        <w:t>Je pense que la requête Eloquent ne filtre pas correctement les bacs selon la zone d'intervention.</w:t>
+      </w:r>
+    </w:p>
+    <w:p>
+      <w:r>
+        <w:t>Merci d'analyser :</w:t>
+      </w:r>
+    </w:p>
+    <w:p>
+      <w:pPr>
+        <w:numPr>
+          <w:ilvl w:val="0"/>
+          <w:numId w:val="2"/>
+        </w:numPr>
+      </w:pPr>
+      <w:proofErr w:type="gramStart"/>
+      <w:r>
+        <w:t>le</w:t>
+      </w:r>
+      <w:proofErr w:type="gramEnd"/>
+      <w:r>
+        <w:t xml:space="preserve"> contrôleur qui charge les bacs ; </w:t>
+      </w:r>
+    </w:p>
+    <w:p>
+      <w:pPr>
+        <w:numPr>
+          <w:ilvl w:val="0"/>
+          <w:numId w:val="2"/>
+        </w:numPr>
+      </w:pPr>
+      <w:proofErr w:type="gramStart"/>
+      <w:r>
+        <w:t>les</w:t>
+      </w:r>
+      <w:proofErr w:type="gramEnd"/>
+      <w:r>
+        <w:t xml:space="preserve"> scopes éventuels ; </w:t>
+      </w:r>
+    </w:p>
+    <w:p>
+      <w:pPr>
+        <w:numPr>
+          <w:ilvl w:val="0"/>
+          <w:numId w:val="2"/>
+        </w:numPr>
+      </w:pPr>
+      <w:proofErr w:type="gramStart"/>
+      <w:r>
+        <w:t>les</w:t>
+      </w:r>
+      <w:proofErr w:type="gramEnd"/>
+      <w:r>
+        <w:t xml:space="preserve"> requêtes Eloquent ; </w:t>
+      </w:r>
+    </w:p>
+    <w:p>
+      <w:pPr>
+        <w:numPr>
+          <w:ilvl w:val="0"/>
+          <w:numId w:val="2"/>
+        </w:numPr>
+      </w:pPr>
+      <w:proofErr w:type="gramStart"/>
+      <w:r>
+        <w:lastRenderedPageBreak/>
+        <w:t>les</w:t>
+      </w:r>
+      <w:proofErr w:type="gramEnd"/>
+      <w:r>
+        <w:t xml:space="preserve"> relations ; </w:t>
+      </w:r>
+    </w:p>
+    <w:p>
+      <w:pPr>
+        <w:numPr>
+          <w:ilvl w:val="0"/>
+          <w:numId w:val="2"/>
+        </w:numPr>
+      </w:pPr>
+      <w:proofErr w:type="gramStart"/>
+      <w:r>
+        <w:t>les</w:t>
+      </w:r>
+      <w:proofErr w:type="gramEnd"/>
+      <w:r>
+        <w:t xml:space="preserve"> composants </w:t>
+      </w:r>
+      <w:proofErr w:type="spellStart"/>
+      <w:r>
+        <w:t>Livewire</w:t>
+      </w:r>
+      <w:proofErr w:type="spellEnd"/>
+      <w:r>
+        <w:t>/</w:t>
+      </w:r>
+      <w:proofErr w:type="spellStart"/>
+      <w:r>
+        <w:t>Inertia</w:t>
+      </w:r>
+      <w:proofErr w:type="spellEnd"/>
+      <w:r>
+        <w:t xml:space="preserve"> si utilisés ; </w:t>
+      </w:r>
+    </w:p>
+    <w:p>
+      <w:pPr>
+        <w:numPr>
+          <w:ilvl w:val="0"/>
+          <w:numId w:val="2"/>
+        </w:numPr>
+      </w:pPr>
+      <w:proofErr w:type="gramStart"/>
+      <w:r>
+        <w:t>la</w:t>
+      </w:r>
+      <w:proofErr w:type="gramEnd"/>
+      <w:r>
+        <w:t xml:space="preserve"> récupération du paramètre "Zone d'intervention". </w:t>
+      </w:r>
+    </w:p>
+    <w:p>
+      <w:r>
+        <w:t>Je souhaite une correction propre de la logique, et non un contournement dans la vue Blade.</w:t>
+      </w:r>
+    </w:p>
+    <w:p/>
     <w:sectPr>
       <w:pgSz w:w="11906" w:h="16838"/>
       <w:pgMar w:top="1417" w:right="1417" w:bottom="1417" w:left="1417" w:header="708" w:footer="708" w:gutter="0"/>
@@ -231,6 +552,279 @@
     </w:sectPr>
   </w:body>
 </w:document>
+</file>
+
+<file path=word/numbering.xml><?xml version="1.0" encoding="utf-8"?>
+<w:numbering xmlns:wpc="http://schemas.microsoft.com/office/word/2010/wordprocessingCanvas" xmlns:cx="http://schemas.microsoft.com/office/drawing/2014/chartex" xmlns:cx1="http://schemas.microsoft.com/office/drawing/2015/9/8/chartex" xmlns:cx2="http://schemas.microsoft.com/office/drawing/2015/10/21/chartex" xmlns:cx3="http://schemas.microsoft.com/office/drawing/2016/5/9/chartex" xmlns:cx4="http://schemas.microsoft.com/office/drawing/2016/5/10/chartex" xmlns:cx5="http://schemas.microsoft.com/office/drawing/2016/5/11/chartex" xmlns:cx6="http://schemas.microsoft.com/office/drawing/2016/5/12/chartex" xmlns:cx7="http://schemas.microsoft.com/office/drawing/2016/5/13/chartex" xmlns:cx8="http://schemas.microsoft.com/office/drawing/2016/5/14/chartex" xmlns:mc="http://schemas.openxmlformats.org/markup-compatibility/2006" xmlns:aink="http://schemas.microsoft.com/office/drawing/2016/ink" xmlns:am3d="http://schemas.microsoft.com/office/drawing/2017/model3d" xmlns:o="urn:schemas-microsoft-com:office:office" xmlns:oel="http://schemas.microsoft.com/office/2019/extlst" xmlns:r="http://schemas.openxmlformats.org/officeDocument/2006/relationships" xmlns:m="http://schemas.openxmlformats.org/officeDocument/2006/math" xmlns:v="urn:schemas-microsoft-com:vml" xmlns:wp14="http://schemas.microsoft.com/office/word/2010/wordprocessingDrawing" xmlns:wp="http://schemas.openxmlformats.org/drawingml/2006/wordprocessingDrawing" xmlns:w10="urn:schemas-microsoft-com:office:word" xmlns:w="http://schemas.openxmlformats.org/wordprocessingml/2006/main" xmlns:w14="http://schemas.microsoft.com/office/word/2010/wordml" xmlns:w15="http://schemas.microsoft.com/office/word/2012/wordml" xmlns:w16cex="http://schemas.microsoft.com/office/word/2018/wordml/cex" xmlns:w16cid="http://schemas.microsoft.com/office/word/2016/wordml/cid" xmlns:w16="http://schemas.microsoft.com/office/word/2018/wordml" xmlns:w16du="http://schemas.microsoft.com/office/word/2023/wordml/word16du" xmlns:w16sdtdh="http://schemas.microsoft.com/office/word/2020/wordml/sdtdatahash" xmlns:w16sdtfl="http://schemas.microsoft.com/office/word/2024/wordml/sdtformatlock" xmlns:w16se="http://schemas.microsoft.com/office/word/2015/wordml/symex" xmlns:wpg="http://schemas.microsoft.com/office/word/2010/wordprocessingGroup" xmlns:wpi="http://schemas.microsoft.com/office/word/2010/wordprocessingInk" xmlns:wne="http://schemas.microsoft.com/office/word/2006/wordml" xmlns:wps="http://schemas.microsoft.com/office/word/2010/wordprocessingShape" mc:Ignorable="w14 w15 w16se w16cid w16 w16cex w16sdtdh w16sdtfl w16du wp14">
+  <w:abstractNum w:abstractNumId="0" w15:restartNumberingAfterBreak="0">
+    <w:nsid w:val="09373917"/>
+    <w:multiLevelType w:val="multilevel"/>
+    <w:tmpl w:val="D0421904"/>
+    <w:lvl w:ilvl="0">
+      <w:start w:val="1"/>
+      <w:numFmt w:val="decimal"/>
+      <w:lvlText w:val="%1."/>
+      <w:lvlJc w:val="left"/>
+      <w:pPr>
+        <w:tabs>
+          <w:tab w:val="num" w:pos="720"/>
+        </w:tabs>
+        <w:ind w:left="720" w:hanging="360"/>
+      </w:pPr>
+    </w:lvl>
+    <w:lvl w:ilvl="1" w:tentative="1">
+      <w:start w:val="1"/>
+      <w:numFmt w:val="decimal"/>
+      <w:lvlText w:val="%2."/>
+      <w:lvlJc w:val="left"/>
+      <w:pPr>
+        <w:tabs>
+          <w:tab w:val="num" w:pos="1440"/>
+        </w:tabs>
+        <w:ind w:left="1440" w:hanging="360"/>
+      </w:pPr>
+    </w:lvl>
+    <w:lvl w:ilvl="2" w:tentative="1">
+      <w:start w:val="1"/>
+      <w:numFmt w:val="decimal"/>
+      <w:lvlText w:val="%3."/>
+      <w:lvlJc w:val="left"/>
+      <w:pPr>
+        <w:tabs>
+          <w:tab w:val="num" w:pos="2160"/>
+        </w:tabs>
+        <w:ind w:left="2160" w:hanging="360"/>
+      </w:pPr>
+    </w:lvl>
+    <w:lvl w:ilvl="3" w:tentative="1">
+      <w:start w:val="1"/>
+      <w:numFmt w:val="decimal"/>
+      <w:lvlText w:val="%4."/>
+      <w:lvlJc w:val="left"/>
+      <w:pPr>
+        <w:tabs>
+          <w:tab w:val="num" w:pos="2880"/>
+        </w:tabs>
+        <w:ind w:left="2880" w:hanging="360"/>
+      </w:pPr>
+    </w:lvl>
+    <w:lvl w:ilvl="4" w:tentative="1">
+      <w:start w:val="1"/>
+      <w:numFmt w:val="decimal"/>
+      <w:lvlText w:val="%5."/>
+      <w:lvlJc w:val="left"/>
+      <w:pPr>
+        <w:tabs>
+          <w:tab w:val="num" w:pos="3600"/>
+        </w:tabs>
+        <w:ind w:left="3600" w:hanging="360"/>
+      </w:pPr>
+    </w:lvl>
+    <w:lvl w:ilvl="5" w:tentative="1">
+      <w:start w:val="1"/>
+      <w:numFmt w:val="decimal"/>
+      <w:lvlText w:val="%6."/>
+      <w:lvlJc w:val="left"/>
+      <w:pPr>
+        <w:tabs>
+          <w:tab w:val="num" w:pos="4320"/>
+        </w:tabs>
+        <w:ind w:left="4320" w:hanging="360"/>
+      </w:pPr>
+    </w:lvl>
+    <w:lvl w:ilvl="6" w:tentative="1">
+      <w:start w:val="1"/>
+      <w:numFmt w:val="decimal"/>
+      <w:lvlText w:val="%7."/>
+      <w:lvlJc w:val="left"/>
+      <w:pPr>
+        <w:tabs>
+          <w:tab w:val="num" w:pos="5040"/>
+        </w:tabs>
+        <w:ind w:left="5040" w:hanging="360"/>
+      </w:pPr>
+    </w:lvl>
+    <w:lvl w:ilvl="7" w:tentative="1">
+      <w:start w:val="1"/>
+      <w:numFmt w:val="decimal"/>
+      <w:lvlText w:val="%8."/>
+      <w:lvlJc w:val="left"/>
+      <w:pPr>
+        <w:tabs>
+          <w:tab w:val="num" w:pos="5760"/>
+        </w:tabs>
+        <w:ind w:left="5760" w:hanging="360"/>
+      </w:pPr>
+    </w:lvl>
+    <w:lvl w:ilvl="8" w:tentative="1">
+      <w:start w:val="1"/>
+      <w:numFmt w:val="decimal"/>
+      <w:lvlText w:val="%9."/>
+      <w:lvlJc w:val="left"/>
+      <w:pPr>
+        <w:tabs>
+          <w:tab w:val="num" w:pos="6480"/>
+        </w:tabs>
+        <w:ind w:left="6480" w:hanging="360"/>
+      </w:pPr>
+    </w:lvl>
+  </w:abstractNum>
+  <w:abstractNum w:abstractNumId="1" w15:restartNumberingAfterBreak="0">
+    <w:nsid w:val="09F93A08"/>
+    <w:multiLevelType w:val="multilevel"/>
+    <w:tmpl w:val="E74AC7DA"/>
+    <w:lvl w:ilvl="0">
+      <w:start w:val="1"/>
+      <w:numFmt w:val="bullet"/>
+      <w:lvlText w:val=""/>
+      <w:lvlJc w:val="left"/>
+      <w:pPr>
+        <w:tabs>
+          <w:tab w:val="num" w:pos="720"/>
+        </w:tabs>
+        <w:ind w:left="720" w:hanging="360"/>
+      </w:pPr>
+      <w:rPr>
+        <w:rFonts w:ascii="Symbol" w:hAnsi="Symbol" w:hint="default"/>
+        <w:sz w:val="20"/>
+      </w:rPr>
+    </w:lvl>
+    <w:lvl w:ilvl="1" w:tentative="1">
+      <w:start w:val="1"/>
+      <w:numFmt w:val="bullet"/>
+      <w:lvlText w:val="o"/>
+      <w:lvlJc w:val="left"/>
+      <w:pPr>
+        <w:tabs>
+          <w:tab w:val="num" w:pos="1440"/>
+        </w:tabs>
+        <w:ind w:left="1440" w:hanging="360"/>
+      </w:pPr>
+      <w:rPr>
+        <w:rFonts w:ascii="Courier New" w:hAnsi="Courier New" w:hint="default"/>
+        <w:sz w:val="20"/>
+      </w:rPr>
+    </w:lvl>
+    <w:lvl w:ilvl="2" w:tentative="1">
+      <w:start w:val="1"/>
+      <w:numFmt w:val="bullet"/>
+      <w:lvlText w:val=""/>
+      <w:lvlJc w:val="left"/>
+      <w:pPr>
+        <w:tabs>
+          <w:tab w:val="num" w:pos="2160"/>
+        </w:tabs>
+        <w:ind w:left="2160" w:hanging="360"/>
+      </w:pPr>
+      <w:rPr>
+        <w:rFonts w:ascii="Wingdings" w:hAnsi="Wingdings" w:hint="default"/>
+        <w:sz w:val="20"/>
+      </w:rPr>
+    </w:lvl>
+    <w:lvl w:ilvl="3" w:tentative="1">
+      <w:start w:val="1"/>
+      <w:numFmt w:val="bullet"/>
+      <w:lvlText w:val=""/>
+      <w:lvlJc w:val="left"/>
+      <w:pPr>
+        <w:tabs>
+          <w:tab w:val="num" w:pos="2880"/>
+        </w:tabs>
+        <w:ind w:left="2880" w:hanging="360"/>
+      </w:pPr>
+      <w:rPr>
+        <w:rFonts w:ascii="Wingdings" w:hAnsi="Wingdings" w:hint="default"/>
+        <w:sz w:val="20"/>
+      </w:rPr>
+    </w:lvl>
+    <w:lvl w:ilvl="4" w:tentative="1">
+      <w:start w:val="1"/>
+      <w:numFmt w:val="bullet"/>
+      <w:lvlText w:val=""/>
+      <w:lvlJc w:val="left"/>
+      <w:pPr>
+        <w:tabs>
+          <w:tab w:val="num" w:pos="3600"/>
+        </w:tabs>
+        <w:ind w:left="3600" w:hanging="360"/>
+      </w:pPr>
+      <w:rPr>
+        <w:rFonts w:ascii="Wingdings" w:hAnsi="Wingdings" w:hint="default"/>
+        <w:sz w:val="20"/>
+      </w:rPr>
+    </w:lvl>
+    <w:lvl w:ilvl="5" w:tentative="1">
+      <w:start w:val="1"/>
+      <w:numFmt w:val="bullet"/>
+      <w:lvlText w:val=""/>
+      <w:lvlJc w:val="left"/>
+      <w:pPr>
+        <w:tabs>
+          <w:tab w:val="num" w:pos="4320"/>
+        </w:tabs>
+        <w:ind w:left="4320" w:hanging="360"/>
+      </w:pPr>
+      <w:rPr>
+        <w:rFonts w:ascii="Wingdings" w:hAnsi="Wingdings" w:hint="default"/>
+        <w:sz w:val="20"/>
+      </w:rPr>
+    </w:lvl>
+    <w:lvl w:ilvl="6" w:tentative="1">
+      <w:start w:val="1"/>
+      <w:numFmt w:val="bullet"/>
+      <w:lvlText w:val=""/>
+      <w:lvlJc w:val="left"/>
+      <w:pPr>
+        <w:tabs>
+          <w:tab w:val="num" w:pos="5040"/>
+        </w:tabs>
+        <w:ind w:left="5040" w:hanging="360"/>
+      </w:pPr>
+      <w:rPr>
+        <w:rFonts w:ascii="Wingdings" w:hAnsi="Wingdings" w:hint="default"/>
+        <w:sz w:val="20"/>
+      </w:rPr>
+    </w:lvl>
+    <w:lvl w:ilvl="7" w:tentative="1">
+      <w:start w:val="1"/>
+      <w:numFmt w:val="bullet"/>
+      <w:lvlText w:val=""/>
+      <w:lvlJc w:val="left"/>
+      <w:pPr>
+        <w:tabs>
+          <w:tab w:val="num" w:pos="5760"/>
+        </w:tabs>
+        <w:ind w:left="5760" w:hanging="360"/>
+      </w:pPr>
+      <w:rPr>
+        <w:rFonts w:ascii="Wingdings" w:hAnsi="Wingdings" w:hint="default"/>
+        <w:sz w:val="20"/>
+      </w:rPr>
+    </w:lvl>
+    <w:lvl w:ilvl="8" w:tentative="1">
+      <w:start w:val="1"/>
+      <w:numFmt w:val="bullet"/>
+      <w:lvlText w:val=""/>
+      <w:lvlJc w:val="left"/>
+      <w:pPr>
+        <w:tabs>
+          <w:tab w:val="num" w:pos="6480"/>
+        </w:tabs>
+        <w:ind w:left="6480" w:hanging="360"/>
+      </w:pPr>
+      <w:rPr>
+        <w:rFonts w:ascii="Wingdings" w:hAnsi="Wingdings" w:hint="default"/>
+        <w:sz w:val="20"/>
+      </w:rPr>
+    </w:lvl>
+  </w:abstractNum>
+  <w:num w:numId="1" w16cid:durableId="2113815152">
+    <w:abstractNumId w:val="0"/>
+  </w:num>
+  <w:num w:numId="2" w16cid:durableId="1407654329">
+    <w:abstractNumId w:val="1"/>
+  </w:num>
+</w:numbering>
 </file>
 
 <file path=word/styles.xml><?xml version="1.0" encoding="utf-8"?>

</xml_diff>

<commit_message>
Mise à jour complète de la plateforme SGID
</commit_message>
<xml_diff>
--- a/docs/ameloration.docx
+++ b/docs/ameloration.docx
@@ -9,28 +9,12 @@
     </w:p>
     <w:p>
       <w:r>
-        <w:t xml:space="preserve">  </w:t>
-      </w:r>
-      <w:proofErr w:type="gramStart"/>
-      <w:r>
-        <w:t>paramètres</w:t>
-      </w:r>
-      <w:proofErr w:type="gramEnd"/>
-      <w:r>
-        <w:t>, le système repositionnait automatiquement les bacs existants autour de cette nouvelle ville pour simuler</w:t>
-      </w:r>
-    </w:p>
-    <w:p>
-      <w:r>
-        <w:t xml:space="preserve">  </w:t>
-      </w:r>
-      <w:proofErr w:type="gramStart"/>
-      <w:r>
-        <w:t>la</w:t>
-      </w:r>
-      <w:proofErr w:type="gramEnd"/>
-      <w:r>
-        <w:t xml:space="preserve"> démonstration. C'est ce qui vous donnait cette impression de "bascule de ville en ville".</w:t>
+        <w:t xml:space="preserve">  paramètres, le système repositionnait automatiquement les bacs existants autour de cette nouvelle ville pour simuler</w:t>
+      </w:r>
+    </w:p>
+    <w:p>
+      <w:r>
+        <w:t xml:space="preserve">  la démonstration. C'est ce qui vous donnait cette impression de "bascule de ville en ville".</w:t>
       </w:r>
     </w:p>
     <w:p/>
@@ -76,41 +60,17 @@
     </w:p>
     <w:p>
       <w:r>
-        <w:t xml:space="preserve">      </w:t>
-      </w:r>
-      <w:proofErr w:type="gramStart"/>
-      <w:r>
-        <w:t>automatiquement</w:t>
-      </w:r>
-      <w:proofErr w:type="gramEnd"/>
-      <w:r>
-        <w:t xml:space="preserve"> un zoom arrière global (niveau 7) centré sur le Bénin et affiche la totalité des bacs présents</w:t>
-      </w:r>
-    </w:p>
-    <w:p>
-      <w:r>
-        <w:t xml:space="preserve">      </w:t>
-      </w:r>
-      <w:proofErr w:type="gramStart"/>
-      <w:r>
-        <w:t>dans</w:t>
-      </w:r>
-      <w:proofErr w:type="gramEnd"/>
-      <w:r>
-        <w:t xml:space="preserve"> votre base de données à leurs vraies coordonnées (Cotonou, Calavi, Bohicon, Natitingou, etc., en même</w:t>
-      </w:r>
-    </w:p>
-    <w:p>
-      <w:r>
-        <w:t xml:space="preserve">      </w:t>
-      </w:r>
-      <w:proofErr w:type="gramStart"/>
-      <w:r>
-        <w:t>temps</w:t>
-      </w:r>
-      <w:proofErr w:type="gramEnd"/>
-      <w:r>
-        <w:t>).</w:t>
+        <w:t xml:space="preserve">      automatiquement un zoom arrière global (niveau 7) centré sur le Bénin et affiche la totalité des bacs présents</w:t>
+      </w:r>
+    </w:p>
+    <w:p>
+      <w:r>
+        <w:t xml:space="preserve">      dans votre base de données à leurs vraies coordonnées (Cotonou, Calavi, Bohicon, Natitingou, etc., en même</w:t>
+      </w:r>
+    </w:p>
+    <w:p>
+      <w:r>
+        <w:t xml:space="preserve">      temps).</w:t>
       </w:r>
     </w:p>
     <w:p>
@@ -120,15 +80,7 @@
     </w:p>
     <w:p>
       <w:r>
-        <w:t xml:space="preserve">      </w:t>
-      </w:r>
-      <w:proofErr w:type="gramStart"/>
-      <w:r>
-        <w:t>coordonnées</w:t>
-      </w:r>
-      <w:proofErr w:type="gramEnd"/>
-      <w:r>
-        <w:t xml:space="preserve"> GPS de vos bacs existants. Ils restent bien fixés à leurs positions réelles.</w:t>
+        <w:t xml:space="preserve">      coordonnées GPS de vos bacs existants. Ils restent bien fixés à leurs positions réelles.</w:t>
       </w:r>
     </w:p>
     <w:p>
@@ -138,102 +90,50 @@
     </w:p>
     <w:p>
       <w:r>
-        <w:t xml:space="preserve">      • Si vous choisissez une ville spécifique (</w:t>
-      </w:r>
-      <w:proofErr w:type="gramStart"/>
-      <w:r>
-        <w:t>ex:</w:t>
-      </w:r>
-      <w:proofErr w:type="gramEnd"/>
-      <w:r>
-        <w:t xml:space="preserve"> Bohicon ou Ouidah) : Seuls les bacs qui se trouvent réellement</w:t>
-      </w:r>
-    </w:p>
-    <w:p>
-      <w:r>
-        <w:t xml:space="preserve">      </w:t>
-      </w:r>
-      <w:proofErr w:type="gramStart"/>
-      <w:r>
-        <w:t>dans</w:t>
-      </w:r>
-      <w:proofErr w:type="gramEnd"/>
-      <w:r>
-        <w:t xml:space="preserve"> cette zone géographique s'afficheront sur la carte et dans les listes. Si aucun bac n'est dans cette ville,</w:t>
-      </w:r>
-    </w:p>
-    <w:p>
-      <w:r>
-        <w:t xml:space="preserve">      </w:t>
-      </w:r>
-      <w:proofErr w:type="gramStart"/>
-      <w:r>
-        <w:t>la</w:t>
-      </w:r>
-      <w:proofErr w:type="gramEnd"/>
-      <w:r>
-        <w:t xml:space="preserve"> carte et le tableau resteront vides</w:t>
+        <w:t xml:space="preserve">      • Si vous choisissez une ville spécifique (ex: Bohicon ou Ouidah) : Seuls les bacs qui se trouvent réellement</w:t>
+      </w:r>
+    </w:p>
+    <w:p>
+      <w:r>
+        <w:t xml:space="preserve">      dans cette zone géographique s'afficheront sur la carte et dans les listes. Si aucun bac n'est dans cette ville,</w:t>
+      </w:r>
+    </w:p>
+    <w:p>
+      <w:r>
+        <w:t xml:space="preserve">      la carte et le tableau resteront vides</w:t>
       </w:r>
     </w:p>
     <w:p/>
     <w:p>
       <w:r>
-        <w:t xml:space="preserve">Et je veux que </w:t>
-      </w:r>
-      <w:proofErr w:type="gramStart"/>
+        <w:t xml:space="preserve">Et je veux que ca soit de meme pour les autre c’est-à-dire collecte ; bacs ;alerte ;rapport ; </w:t>
+      </w:r>
+      <w:proofErr w:type="spellStart"/>
+      <w:r>
+        <w:t>staistique</w:t>
+      </w:r>
+      <w:proofErr w:type="spellEnd"/>
+      <w:r>
+        <w:t xml:space="preserve"> ; tout le tableau de bord </w:t>
+      </w:r>
+      <w:proofErr w:type="spellStart"/>
+      <w:r>
+        <w:t>aussu</w:t>
+      </w:r>
+      <w:proofErr w:type="spellEnd"/>
+      <w:r>
+        <w:t> ::</w:t>
+      </w:r>
+    </w:p>
+    <w:p>
+      <w:r>
+        <w:t xml:space="preserve">NB : fait </w:t>
+      </w:r>
+      <w:proofErr w:type="spellStart"/>
       <w:r>
         <w:t>ca</w:t>
       </w:r>
-      <w:proofErr w:type="gramEnd"/>
-      <w:r>
-        <w:t xml:space="preserve"> soit de meme pour </w:t>
-      </w:r>
-      <w:proofErr w:type="gramStart"/>
-      <w:r>
-        <w:t>les autre</w:t>
-      </w:r>
-      <w:proofErr w:type="gramEnd"/>
-      <w:r>
-        <w:t xml:space="preserve"> c’est-à-dire collecte ; bacs</w:t>
-      </w:r>
-      <w:proofErr w:type="gramStart"/>
-      <w:r>
-        <w:t> ;alerte ;rapport</w:t>
-      </w:r>
-      <w:proofErr w:type="gramEnd"/>
-      <w:r>
-        <w:t xml:space="preserve"> ; </w:t>
-      </w:r>
-      <w:proofErr w:type="spellStart"/>
-      <w:r>
-        <w:t>staistique</w:t>
-      </w:r>
       <w:proofErr w:type="spellEnd"/>
-      <w:r>
-        <w:t xml:space="preserve"> ; tout le tableau de bord </w:t>
-      </w:r>
-      <w:proofErr w:type="spellStart"/>
-      <w:proofErr w:type="gramStart"/>
-      <w:r>
-        <w:t>aussu</w:t>
-      </w:r>
-      <w:proofErr w:type="spellEnd"/>
-      <w:r>
-        <w:t> ::</w:t>
-      </w:r>
-      <w:proofErr w:type="gramEnd"/>
-    </w:p>
-    <w:p>
-      <w:r>
-        <w:t xml:space="preserve">NB : fait </w:t>
-      </w:r>
-      <w:proofErr w:type="spellStart"/>
-      <w:proofErr w:type="gramStart"/>
-      <w:r>
-        <w:t>ca</w:t>
-      </w:r>
-      <w:proofErr w:type="spellEnd"/>
-      <w:proofErr w:type="gramEnd"/>
       <w:r>
         <w:t xml:space="preserve"> d’</w:t>
       </w:r>
@@ -371,15 +271,7 @@
         </w:numPr>
       </w:pPr>
       <w:r>
-        <w:t xml:space="preserve">Si une ville est sélectionnée (exemple : Djougou), afficher uniquement les bacs dont les coordonnées GPS </w:t>
-      </w:r>
-      <w:proofErr w:type="gramStart"/>
-      <w:r>
-        <w:t>appartiennent</w:t>
-      </w:r>
-      <w:proofErr w:type="gramEnd"/>
-      <w:r>
-        <w:t xml:space="preserve"> à cette ville. </w:t>
+        <w:t xml:space="preserve">Si une ville est sélectionnée (exemple : Djougou), afficher uniquement les bacs dont les coordonnées GPS appartiennent à cette ville. </w:t>
       </w:r>
     </w:p>
     <w:p>
@@ -432,13 +324,8 @@
           <w:numId w:val="2"/>
         </w:numPr>
       </w:pPr>
-      <w:proofErr w:type="gramStart"/>
-      <w:r>
-        <w:t>le</w:t>
-      </w:r>
-      <w:proofErr w:type="gramEnd"/>
-      <w:r>
-        <w:t xml:space="preserve"> contrôleur qui charge les bacs ; </w:t>
+      <w:r>
+        <w:t xml:space="preserve">le contrôleur qui charge les bacs ; </w:t>
       </w:r>
     </w:p>
     <w:p>
@@ -448,13 +335,8 @@
           <w:numId w:val="2"/>
         </w:numPr>
       </w:pPr>
-      <w:proofErr w:type="gramStart"/>
-      <w:r>
-        <w:t>les</w:t>
-      </w:r>
-      <w:proofErr w:type="gramEnd"/>
-      <w:r>
-        <w:t xml:space="preserve"> scopes éventuels ; </w:t>
+      <w:r>
+        <w:t xml:space="preserve">les scopes éventuels ; </w:t>
       </w:r>
     </w:p>
     <w:p>
@@ -464,13 +346,8 @@
           <w:numId w:val="2"/>
         </w:numPr>
       </w:pPr>
-      <w:proofErr w:type="gramStart"/>
-      <w:r>
-        <w:t>les</w:t>
-      </w:r>
-      <w:proofErr w:type="gramEnd"/>
-      <w:r>
-        <w:t xml:space="preserve"> requêtes Eloquent ; </w:t>
+      <w:r>
+        <w:t xml:space="preserve">les requêtes Eloquent ; </w:t>
       </w:r>
     </w:p>
     <w:p>
@@ -480,14 +357,9 @@
           <w:numId w:val="2"/>
         </w:numPr>
       </w:pPr>
-      <w:proofErr w:type="gramStart"/>
       <w:r>
         <w:lastRenderedPageBreak/>
-        <w:t>les</w:t>
-      </w:r>
-      <w:proofErr w:type="gramEnd"/>
-      <w:r>
-        <w:t xml:space="preserve"> relations ; </w:t>
+        <w:t xml:space="preserve">les relations ; </w:t>
       </w:r>
     </w:p>
     <w:p>
@@ -497,13 +369,8 @@
           <w:numId w:val="2"/>
         </w:numPr>
       </w:pPr>
-      <w:proofErr w:type="gramStart"/>
-      <w:r>
-        <w:t>les</w:t>
-      </w:r>
-      <w:proofErr w:type="gramEnd"/>
-      <w:r>
-        <w:t xml:space="preserve"> composants </w:t>
+      <w:r>
+        <w:t xml:space="preserve">les composants </w:t>
       </w:r>
       <w:proofErr w:type="spellStart"/>
       <w:r>
@@ -529,13 +396,8 @@
           <w:numId w:val="2"/>
         </w:numPr>
       </w:pPr>
-      <w:proofErr w:type="gramStart"/>
-      <w:r>
-        <w:t>la</w:t>
-      </w:r>
-      <w:proofErr w:type="gramEnd"/>
-      <w:r>
-        <w:t xml:space="preserve"> récupération du paramètre "Zone d'intervention". </w:t>
+      <w:r>
+        <w:t xml:space="preserve">la récupération du paramètre "Zone d'intervention". </w:t>
       </w:r>
     </w:p>
     <w:p>
@@ -544,6 +406,86 @@
       </w:r>
     </w:p>
     <w:p/>
+    <w:p/>
+    <w:p>
+      <w:r>
+        <w:t xml:space="preserve">  Nous pouvons rendre la liste des villes entièrement dynamique.</w:t>
+      </w:r>
+    </w:p>
+    <w:p/>
+    <w:p>
+      <w:r>
+        <w:t xml:space="preserve">  ### </w:t>
+      </w:r>
+      <w:r>
+        <w:rPr>
+          <w:rFonts w:ascii="Segoe UI Emoji" w:hAnsi="Segoe UI Emoji" w:cs="Segoe UI Emoji"/>
+        </w:rPr>
+        <w:t>💡</w:t>
+      </w:r>
+      <w:r>
+        <w:t xml:space="preserve"> Comment cela fonctionne :</w:t>
+      </w:r>
+    </w:p>
+    <w:p/>
+    <w:p>
+      <w:r>
+        <w:t xml:space="preserve">  Au lieu d'avoir une liste de villes figée dans le code, la plateforme va analyser en temps réel les bacs enregistrés</w:t>
+      </w:r>
+    </w:p>
+    <w:p>
+      <w:r>
+        <w:t xml:space="preserve">  en base de données :</w:t>
+      </w:r>
+    </w:p>
+    <w:p/>
+    <w:p>
+      <w:r>
+        <w:t xml:space="preserve">  1. Dès qu'un nouveau bac est ajouté (ex: avec l'adresse  "Quartier Est, Savalou" ), le système va détecter le mot</w:t>
+      </w:r>
+    </w:p>
+    <w:p>
+      <w:r>
+        <w:t xml:space="preserve">  Savalou.</w:t>
+      </w:r>
+    </w:p>
+    <w:p>
+      <w:r>
+        <w:t xml:space="preserve">  2. Il va automatiquement rajouter « Savalou » à la liste des filtres de la plateforme (sans que vous n'ayez rien à</w:t>
+      </w:r>
+    </w:p>
+    <w:p>
+      <w:r>
+        <w:t xml:space="preserve">  coder).</w:t>
+      </w:r>
+    </w:p>
+    <w:p>
+      <w:r>
+        <w:t xml:space="preserve">  3. Pour centrer la carte sur cette nouvelle ville, le système va automatiquement calculer le centre en faisant la</w:t>
+      </w:r>
+    </w:p>
+    <w:p>
+      <w:r>
+        <w:t xml:space="preserve">  moyenne des coordonnées GPS du ou des bacs situés à Savalou.</w:t>
+      </w:r>
+    </w:p>
+    <w:p/>
+    <w:p>
+      <w:r>
+        <w:t xml:space="preserve">  C'est une solution très propre qui s'adapte automatiquement à toutes les nouvelles villes que vous ajouterez dans le</w:t>
+      </w:r>
+    </w:p>
+    <w:p>
+      <w:r>
+        <w:t xml:space="preserve">  futur !</w:t>
+      </w:r>
+    </w:p>
+    <w:p/>
+    <w:p>
+      <w:r>
+        <w:t xml:space="preserve">  Voulez-vous que j'applique cette logique sur votre serveur local ?</w:t>
+      </w:r>
+    </w:p>
     <w:sectPr>
       <w:pgSz w:w="11906" w:h="16838"/>
       <w:pgMar w:top="1417" w:right="1417" w:bottom="1417" w:left="1417" w:header="708" w:footer="708" w:gutter="0"/>

</xml_diff>